<commit_message>
Updates to flowhart and word doc
</commit_message>
<xml_diff>
--- a/template-project survey.docx
+++ b/template-project survey.docx
@@ -6,6 +6,10 @@
     <w:p>
       <w:pPr>
         <w:pStyle w:val="Heading1"/>
+        <w:numPr>
+          <w:ilvl w:val="0"/>
+          <w:numId w:val="16"/>
+        </w:numPr>
       </w:pPr>
       <w:r>
         <w:t>Introduction</w:t>
@@ -27,7 +31,16 @@
         <w:t xml:space="preserve"> that users can log into and communicate securely. </w:t>
       </w:r>
       <w:r>
-        <w:t xml:space="preserve">There will also be an option for a user to communicate insecurely within the same chat room. Choosing </w:t>
+        <w:t xml:space="preserve">A stretch goal we have is the </w:t>
+      </w:r>
+      <w:r>
+        <w:t xml:space="preserve">option for a user to communicate insecurely within the same chat room. </w:t>
+      </w:r>
+      <w:r>
+        <w:t>Enabling</w:t>
+      </w:r>
+      <w:r>
+        <w:t xml:space="preserve"> </w:t>
       </w:r>
       <w:r>
         <w:t xml:space="preserve">this option will </w:t>
@@ -78,15 +91,7 @@
         <w:t>messages,</w:t>
       </w:r>
       <w:r>
-        <w:t xml:space="preserve"> but </w:t>
-      </w:r>
-      <w:proofErr w:type="gramStart"/>
-      <w:r>
-        <w:t>plaintext</w:t>
-      </w:r>
-      <w:proofErr w:type="gramEnd"/>
-      <w:r>
-        <w:t xml:space="preserve"> messages </w:t>
+        <w:t xml:space="preserve"> but plaintext messages </w:t>
       </w:r>
       <w:r>
         <w:t xml:space="preserve">transmitted from </w:t>
@@ -171,13 +176,38 @@
         <w:t xml:space="preserve"> </w:t>
       </w:r>
     </w:p>
+    <w:p>
+      <w:pPr>
+        <w:pStyle w:val="ListParagraph"/>
+        <w:numPr>
+          <w:ilvl w:val="0"/>
+          <w:numId w:val="10"/>
+        </w:numPr>
+      </w:pPr>
+      <w:r>
+        <w:t xml:space="preserve">Asynchronous </w:t>
+      </w:r>
+      <w:r>
+        <w:t>encryption algorithm development</w:t>
+      </w:r>
+    </w:p>
     <w:p/>
     <w:p>
       <w:pPr>
         <w:pStyle w:val="Heading1"/>
-      </w:pPr>
-      <w:r>
-        <w:t>Background and Literature Review</w:t>
+        <w:numPr>
+          <w:ilvl w:val="0"/>
+          <w:numId w:val="16"/>
+        </w:numPr>
+      </w:pPr>
+      <w:r>
+        <w:t xml:space="preserve">Background and </w:t>
+      </w:r>
+      <w:r>
+        <w:t>Literature</w:t>
+      </w:r>
+      <w:r>
+        <w:t xml:space="preserve"> Review</w:t>
       </w:r>
     </w:p>
     <w:p>
@@ -210,12 +240,15 @@
     <w:p/>
     <w:p/>
     <w:p>
+      <w:pPr>
+        <w:pStyle w:val="Heading1"/>
+      </w:pPr>
       <w:r>
         <w:lastRenderedPageBreak/>
         <w:t>3</w:t>
       </w:r>
       <w:r>
-        <w:t>. Methodology:</w:t>
+        <w:t>. Methodology</w:t>
       </w:r>
     </w:p>
     <w:p>
@@ -227,6 +260,558 @@
       </w:r>
       <w:r>
         <w:t xml:space="preserve"> </w:t>
+      </w:r>
+      <w:r>
+        <w:t xml:space="preserve">The server will work in broadcast mode, meaning all users will see every message. </w:t>
+      </w:r>
+    </w:p>
+    <w:p>
+      <w:r>
+        <w:t xml:space="preserve">For research, common asynchronous encryption techniques will be </w:t>
+      </w:r>
+      <w:r>
+        <w:t xml:space="preserve">studied to aid in the development of this software. </w:t>
+      </w:r>
+    </w:p>
+    <w:p>
+      <w:pPr>
+        <w:keepNext/>
+        <w:jc w:val="center"/>
+      </w:pPr>
+      <w:r>
+        <w:drawing>
+          <wp:inline distT="0" distB="0" distL="0" distR="0" wp14:anchorId="008311EB" wp14:editId="3F531453">
+            <wp:extent cx="3302170" cy="2787793"/>
+            <wp:effectExtent l="0" t="0" r="0" b="0"/>
+            <wp:docPr id="1771431928" name="Picture 1"/>
+            <wp:cNvGraphicFramePr>
+              <a:graphicFrameLocks xmlns:a="http://schemas.openxmlformats.org/drawingml/2006/main" noChangeAspect="1"/>
+            </wp:cNvGraphicFramePr>
+            <a:graphic xmlns:a="http://schemas.openxmlformats.org/drawingml/2006/main">
+              <a:graphicData uri="http://schemas.openxmlformats.org/drawingml/2006/picture">
+                <pic:pic xmlns:pic="http://schemas.openxmlformats.org/drawingml/2006/picture">
+                  <pic:nvPicPr>
+                    <pic:cNvPr id="1771431928" name=""/>
+                    <pic:cNvPicPr/>
+                  </pic:nvPicPr>
+                  <pic:blipFill>
+                    <a:blip r:embed="rId5"/>
+                    <a:stretch>
+                      <a:fillRect/>
+                    </a:stretch>
+                  </pic:blipFill>
+                  <pic:spPr>
+                    <a:xfrm>
+                      <a:off x="0" y="0"/>
+                      <a:ext cx="3302170" cy="2787793"/>
+                    </a:xfrm>
+                    <a:prstGeom prst="rect">
+                      <a:avLst/>
+                    </a:prstGeom>
+                  </pic:spPr>
+                </pic:pic>
+              </a:graphicData>
+            </a:graphic>
+          </wp:inline>
+        </w:drawing>
+      </w:r>
+    </w:p>
+    <w:p>
+      <w:pPr>
+        <w:pStyle w:val="Caption"/>
+        <w:jc w:val="center"/>
+      </w:pPr>
+      <w:r>
+        <w:t xml:space="preserve">Figure </w:t>
+      </w:r>
+      <w:fldSimple w:instr=" SEQ Figure \* ARABIC ">
+        <w:r>
+          <w:rPr>
+            <w:noProof/>
+          </w:rPr>
+          <w:t>1</w:t>
+        </w:r>
+      </w:fldSimple>
+      <w:r>
+        <w:t xml:space="preserve"> - Client and Server Relationship</w:t>
+      </w:r>
+    </w:p>
+    <w:p/>
+    <w:p>
+      <w:pPr>
+        <w:keepNext/>
+        <w:jc w:val="center"/>
+      </w:pPr>
+      <w:r>
+        <w:rPr>
+          <w:noProof/>
+        </w:rPr>
+        <w:lastRenderedPageBreak/>
+        <w:drawing>
+          <wp:inline distT="0" distB="0" distL="0" distR="0" wp14:anchorId="367A6B0D" wp14:editId="4D4B8C79">
+            <wp:extent cx="2260600" cy="4051300"/>
+            <wp:effectExtent l="0" t="0" r="6350" b="6350"/>
+            <wp:docPr id="1867639647" name="Picture 2"/>
+            <wp:cNvGraphicFramePr>
+              <a:graphicFrameLocks xmlns:a="http://schemas.openxmlformats.org/drawingml/2006/main" noChangeAspect="1"/>
+            </wp:cNvGraphicFramePr>
+            <a:graphic xmlns:a="http://schemas.openxmlformats.org/drawingml/2006/main">
+              <a:graphicData uri="http://schemas.openxmlformats.org/drawingml/2006/picture">
+                <pic:pic xmlns:pic="http://schemas.openxmlformats.org/drawingml/2006/picture">
+                  <pic:nvPicPr>
+                    <pic:cNvPr id="0" name="Picture 2"/>
+                    <pic:cNvPicPr>
+                      <a:picLocks noChangeAspect="1" noChangeArrowheads="1"/>
+                    </pic:cNvPicPr>
+                  </pic:nvPicPr>
+                  <pic:blipFill>
+                    <a:blip r:embed="rId6">
+                      <a:extLst>
+                        <a:ext uri="{28A0092B-C50C-407E-A947-70E740481C1C}">
+                          <a14:useLocalDpi xmlns:a14="http://schemas.microsoft.com/office/drawing/2010/main" val="0"/>
+                        </a:ext>
+                      </a:extLst>
+                    </a:blip>
+                    <a:srcRect/>
+                    <a:stretch>
+                      <a:fillRect/>
+                    </a:stretch>
+                  </pic:blipFill>
+                  <pic:spPr bwMode="auto">
+                    <a:xfrm>
+                      <a:off x="0" y="0"/>
+                      <a:ext cx="2260600" cy="4051300"/>
+                    </a:xfrm>
+                    <a:prstGeom prst="rect">
+                      <a:avLst/>
+                    </a:prstGeom>
+                    <a:noFill/>
+                    <a:ln>
+                      <a:noFill/>
+                    </a:ln>
+                  </pic:spPr>
+                </pic:pic>
+              </a:graphicData>
+            </a:graphic>
+          </wp:inline>
+        </w:drawing>
+      </w:r>
+    </w:p>
+    <w:p>
+      <w:pPr>
+        <w:pStyle w:val="Caption"/>
+        <w:jc w:val="center"/>
+      </w:pPr>
+      <w:r>
+        <w:t xml:space="preserve">Figure </w:t>
+      </w:r>
+      <w:fldSimple w:instr=" SEQ Figure \* ARABIC ">
+        <w:r>
+          <w:rPr>
+            <w:noProof/>
+          </w:rPr>
+          <w:t>2</w:t>
+        </w:r>
+      </w:fldSimple>
+      <w:r>
+        <w:t xml:space="preserve"> - Message and Key Handling</w:t>
+      </w:r>
+    </w:p>
+    <w:p/>
+    <w:p/>
+    <w:p>
+      <w:pPr>
+        <w:pStyle w:val="Heading1"/>
+      </w:pPr>
+      <w:r>
+        <w:t>4</w:t>
+      </w:r>
+      <w:r>
+        <w:t>. Expected Outcomes</w:t>
+      </w:r>
+    </w:p>
+    <w:p>
+      <w:r>
+        <w:tab/>
+      </w:r>
+      <w:r>
+        <w:t>Goals:</w:t>
+      </w:r>
+    </w:p>
+    <w:p>
+      <w:pPr>
+        <w:pStyle w:val="ListParagraph"/>
+        <w:numPr>
+          <w:ilvl w:val="0"/>
+          <w:numId w:val="12"/>
+        </w:numPr>
+      </w:pPr>
+      <w:r>
+        <w:t>Create a chatroom where multiple users</w:t>
+      </w:r>
+      <w:r>
+        <w:t xml:space="preserve"> </w:t>
+      </w:r>
+      <w:r>
+        <w:t>can communicate securely</w:t>
+      </w:r>
+    </w:p>
+    <w:p>
+      <w:pPr>
+        <w:pStyle w:val="ListParagraph"/>
+        <w:numPr>
+          <w:ilvl w:val="0"/>
+          <w:numId w:val="12"/>
+        </w:numPr>
+      </w:pPr>
+      <w:r>
+        <w:t>Create a chatroom where users can choose to send their messages as plaintext</w:t>
+      </w:r>
+    </w:p>
+    <w:p>
+      <w:pPr>
+        <w:pStyle w:val="ListParagraph"/>
+        <w:numPr>
+          <w:ilvl w:val="0"/>
+          <w:numId w:val="12"/>
+        </w:numPr>
+      </w:pPr>
+      <w:r>
+        <w:t xml:space="preserve">Create a chatroom where all </w:t>
+      </w:r>
+      <w:r>
+        <w:t>transmitted data is logged securely</w:t>
+      </w:r>
+    </w:p>
+    <w:p>
+      <w:pPr>
+        <w:ind w:left="720"/>
+      </w:pPr>
+      <w:r>
+        <w:t xml:space="preserve">Stretch Goals: </w:t>
+      </w:r>
+    </w:p>
+    <w:p>
+      <w:pPr>
+        <w:pStyle w:val="ListParagraph"/>
+        <w:numPr>
+          <w:ilvl w:val="0"/>
+          <w:numId w:val="13"/>
+        </w:numPr>
+      </w:pPr>
+      <w:r>
+        <w:t>User authentication for login</w:t>
+      </w:r>
+    </w:p>
+    <w:p>
+      <w:pPr>
+        <w:pStyle w:val="ListParagraph"/>
+        <w:numPr>
+          <w:ilvl w:val="0"/>
+          <w:numId w:val="13"/>
+        </w:numPr>
+      </w:pPr>
+      <w:r>
+        <w:t xml:space="preserve">Develop a way for the server to only open the chatroom port if a user requests access. This way, the port isn’t open when the chatroom isn’t being used. </w:t>
+      </w:r>
+    </w:p>
+    <w:p/>
+    <w:p/>
+    <w:p/>
+    <w:p/>
+    <w:p>
+      <w:pPr>
+        <w:pStyle w:val="Heading1"/>
+      </w:pPr>
+      <w:r>
+        <w:t>5</w:t>
+      </w:r>
+      <w:r>
+        <w:t>. Timeline</w:t>
+      </w:r>
+    </w:p>
+    <w:p>
+      <w:pPr>
+        <w:keepNext/>
+        <w:jc w:val="center"/>
+      </w:pPr>
+      <w:r>
+        <w:drawing>
+          <wp:inline distT="0" distB="0" distL="0" distR="0" wp14:anchorId="15BE772F" wp14:editId="4B31A8E6">
+            <wp:extent cx="5943600" cy="2098675"/>
+            <wp:effectExtent l="0" t="0" r="0" b="0"/>
+            <wp:docPr id="1103453929" name="Picture 1"/>
+            <wp:cNvGraphicFramePr>
+              <a:graphicFrameLocks xmlns:a="http://schemas.openxmlformats.org/drawingml/2006/main" noChangeAspect="1"/>
+            </wp:cNvGraphicFramePr>
+            <a:graphic xmlns:a="http://schemas.openxmlformats.org/drawingml/2006/main">
+              <a:graphicData uri="http://schemas.openxmlformats.org/drawingml/2006/picture">
+                <pic:pic xmlns:pic="http://schemas.openxmlformats.org/drawingml/2006/picture">
+                  <pic:nvPicPr>
+                    <pic:cNvPr id="1103453929" name=""/>
+                    <pic:cNvPicPr/>
+                  </pic:nvPicPr>
+                  <pic:blipFill>
+                    <a:blip r:embed="rId7"/>
+                    <a:stretch>
+                      <a:fillRect/>
+                    </a:stretch>
+                  </pic:blipFill>
+                  <pic:spPr>
+                    <a:xfrm>
+                      <a:off x="0" y="0"/>
+                      <a:ext cx="5943600" cy="2098675"/>
+                    </a:xfrm>
+                    <a:prstGeom prst="rect">
+                      <a:avLst/>
+                    </a:prstGeom>
+                  </pic:spPr>
+                </pic:pic>
+              </a:graphicData>
+            </a:graphic>
+          </wp:inline>
+        </w:drawing>
+      </w:r>
+    </w:p>
+    <w:p>
+      <w:pPr>
+        <w:pStyle w:val="Caption"/>
+        <w:jc w:val="center"/>
+      </w:pPr>
+      <w:r>
+        <w:t xml:space="preserve">Figure </w:t>
+      </w:r>
+      <w:fldSimple w:instr=" SEQ Figure \* ARABIC ">
+        <w:r>
+          <w:rPr>
+            <w:noProof/>
+          </w:rPr>
+          <w:t>3</w:t>
+        </w:r>
+      </w:fldSimple>
+      <w:r>
+        <w:t xml:space="preserve"> - Project Schedule</w:t>
+      </w:r>
+    </w:p>
+    <w:p/>
+    <w:p>
+      <w:pPr>
+        <w:pStyle w:val="Heading1"/>
+      </w:pPr>
+      <w:r>
+        <w:t>6</w:t>
+      </w:r>
+      <w:r>
+        <w:t>. Resources</w:t>
+      </w:r>
+    </w:p>
+    <w:p>
+      <w:pPr>
+        <w:pStyle w:val="ListParagraph"/>
+        <w:numPr>
+          <w:ilvl w:val="0"/>
+          <w:numId w:val="14"/>
+        </w:numPr>
+      </w:pPr>
+      <w:r>
+        <w:t>Free or low-cost hosting solution.</w:t>
+      </w:r>
+    </w:p>
+    <w:p>
+      <w:pPr>
+        <w:pStyle w:val="ListParagraph"/>
+        <w:numPr>
+          <w:ilvl w:val="0"/>
+          <w:numId w:val="14"/>
+        </w:numPr>
+      </w:pPr>
+      <w:r>
+        <w:t xml:space="preserve">PCs with a Python development environment. </w:t>
+      </w:r>
+    </w:p>
+    <w:p/>
+    <w:p>
+      <w:pPr>
+        <w:pStyle w:val="Heading1"/>
+      </w:pPr>
+      <w:r>
+        <w:t>7</w:t>
+      </w:r>
+      <w:r>
+        <w:t>. Ethical Considerations</w:t>
+      </w:r>
+    </w:p>
+    <w:p>
+      <w:pPr>
+        <w:pStyle w:val="ListParagraph"/>
+        <w:numPr>
+          <w:ilvl w:val="0"/>
+          <w:numId w:val="15"/>
+        </w:numPr>
+      </w:pPr>
+      <w:r>
+        <w:t>All user data will be logged.</w:t>
+      </w:r>
+    </w:p>
+    <w:p>
+      <w:pPr>
+        <w:pStyle w:val="ListParagraph"/>
+        <w:numPr>
+          <w:ilvl w:val="1"/>
+          <w:numId w:val="15"/>
+        </w:numPr>
+      </w:pPr>
+      <w:r>
+        <w:t xml:space="preserve">Users will be notified that all </w:t>
+      </w:r>
+      <w:r>
+        <w:t xml:space="preserve">transmitted </w:t>
+      </w:r>
+      <w:r>
+        <w:t>data is logged.</w:t>
+      </w:r>
+    </w:p>
+    <w:p>
+      <w:pPr>
+        <w:pStyle w:val="ListParagraph"/>
+        <w:numPr>
+          <w:ilvl w:val="1"/>
+          <w:numId w:val="15"/>
+        </w:numPr>
+      </w:pPr>
+      <w:r>
+        <w:t>Logging</w:t>
+      </w:r>
+      <w:r>
+        <w:t xml:space="preserve"> data will allow for illicit use to be reviewed by </w:t>
+      </w:r>
+      <w:r>
+        <w:t xml:space="preserve">a system administrator if needed. </w:t>
+      </w:r>
+    </w:p>
+    <w:p>
+      <w:pPr>
+        <w:pStyle w:val="ListParagraph"/>
+        <w:numPr>
+          <w:ilvl w:val="1"/>
+          <w:numId w:val="15"/>
+        </w:numPr>
+      </w:pPr>
+      <w:r>
+        <w:t xml:space="preserve">Notifying the user of this provides transparency about the limitations of privacy </w:t>
+      </w:r>
+      <w:r>
+        <w:t xml:space="preserve">when using the system. </w:t>
+      </w:r>
+    </w:p>
+    <w:p>
+      <w:pPr>
+        <w:pStyle w:val="ListParagraph"/>
+        <w:numPr>
+          <w:ilvl w:val="0"/>
+          <w:numId w:val="15"/>
+        </w:numPr>
+      </w:pPr>
+      <w:r>
+        <w:t xml:space="preserve">The system will not remain active when not in use by students for the purpose of development, test, and </w:t>
+      </w:r>
+      <w:r>
+        <w:t xml:space="preserve">demonstration. </w:t>
+      </w:r>
+    </w:p>
+    <w:p>
+      <w:pPr>
+        <w:pStyle w:val="ListParagraph"/>
+        <w:numPr>
+          <w:ilvl w:val="1"/>
+          <w:numId w:val="15"/>
+        </w:numPr>
+      </w:pPr>
+      <w:r>
+        <w:t xml:space="preserve">This prevents the </w:t>
+      </w:r>
+      <w:r>
+        <w:t>long-term</w:t>
+      </w:r>
+      <w:r>
+        <w:t xml:space="preserve"> use of the system for illicit or illegal behavior. </w:t>
+      </w:r>
+    </w:p>
+    <w:p>
+      <w:pPr>
+        <w:pStyle w:val="ListParagraph"/>
+        <w:numPr>
+          <w:ilvl w:val="0"/>
+          <w:numId w:val="15"/>
+        </w:numPr>
+      </w:pPr>
+      <w:r>
+        <w:t>Access to the system will be shared in a limited fashion.</w:t>
+      </w:r>
+    </w:p>
+    <w:p>
+      <w:pPr>
+        <w:pStyle w:val="ListParagraph"/>
+        <w:numPr>
+          <w:ilvl w:val="1"/>
+          <w:numId w:val="15"/>
+        </w:numPr>
+      </w:pPr>
+      <w:r>
+        <w:t xml:space="preserve">By controlling the use </w:t>
+      </w:r>
+      <w:r>
+        <w:t xml:space="preserve">of the system, the risk of its use for illicit or illegal behavior is reduced. </w:t>
+      </w:r>
+    </w:p>
+    <w:p/>
+    <w:p/>
+    <w:p/>
+    <w:p/>
+    <w:p/>
+    <w:p>
+      <w:pPr>
+        <w:pStyle w:val="Heading1"/>
+      </w:pPr>
+    </w:p>
+    <w:p>
+      <w:pPr>
+        <w:pStyle w:val="Heading1"/>
+      </w:pPr>
+      <w:r>
+        <w:t>8</w:t>
+      </w:r>
+      <w:r>
+        <w:t>. Conclusion</w:t>
+      </w:r>
+    </w:p>
+    <w:p>
+      <w:r>
+        <w:t xml:space="preserve">This project will serve as an opportunity to </w:t>
+      </w:r>
+      <w:r>
+        <w:t>learn asynchronous encryption by implementing it.</w:t>
+      </w:r>
+      <w:r>
+        <w:t xml:space="preserve"> The intent is to focus on building something that is simple, but foundationally secure and robust from a security standpoint. </w:t>
+      </w:r>
+    </w:p>
+    <w:p/>
+    <w:p/>
+    <w:p/>
+    <w:p/>
+    <w:p/>
+    <w:p/>
+    <w:p/>
+    <w:p>
+      <w:pPr>
+        <w:pStyle w:val="Heading1"/>
+      </w:pPr>
+      <w:r>
+        <w:t>9</w:t>
+      </w:r>
+      <w:r>
+        <w:t>. References</w:t>
       </w:r>
     </w:p>
     <w:p>
@@ -238,256 +823,6 @@
         </w:numPr>
       </w:pPr>
       <w:r>
-        <w:t>Describe the research design or methodology that will be used to achieve the project objectives.</w:t>
-      </w:r>
-    </w:p>
-    <w:p>
-      <w:pPr>
-        <w:pStyle w:val="ListParagraph"/>
-        <w:numPr>
-          <w:ilvl w:val="0"/>
-          <w:numId w:val="2"/>
-        </w:numPr>
-      </w:pPr>
-      <w:r>
-        <w:t>Explain the data collection methods, tools, or techniques that will be employed.</w:t>
-      </w:r>
-    </w:p>
-    <w:p>
-      <w:pPr>
-        <w:pStyle w:val="ListParagraph"/>
-        <w:numPr>
-          <w:ilvl w:val="0"/>
-          <w:numId w:val="2"/>
-        </w:numPr>
-      </w:pPr>
-      <w:r>
-        <w:t xml:space="preserve">Outline </w:t>
-      </w:r>
-      <w:r>
-        <w:t xml:space="preserve">the steps or procedures </w:t>
-      </w:r>
-      <w:r>
-        <w:t>that will be followed to conduct the project.</w:t>
-      </w:r>
-    </w:p>
-    <w:p>
-      <w:pPr>
-        <w:pStyle w:val="ListParagraph"/>
-        <w:numPr>
-          <w:ilvl w:val="1"/>
-          <w:numId w:val="2"/>
-        </w:numPr>
-      </w:pPr>
-      <w:r>
-        <w:t>A flowchart/diagram is required to show the steps or procedures.</w:t>
-      </w:r>
-    </w:p>
-    <w:p/>
-    <w:p/>
-    <w:p/>
-    <w:p>
-      <w:r>
-        <w:t>4</w:t>
-      </w:r>
-      <w:r>
-        <w:t>. Expected Outcomes:</w:t>
-      </w:r>
-    </w:p>
-    <w:p>
-      <w:pPr>
-        <w:pStyle w:val="ListParagraph"/>
-        <w:numPr>
-          <w:ilvl w:val="0"/>
-          <w:numId w:val="2"/>
-        </w:numPr>
-      </w:pPr>
-      <w:r>
-        <w:t>Describe the anticipated results or outcomes of the project.</w:t>
-      </w:r>
-    </w:p>
-    <w:p/>
-    <w:p/>
-    <w:p/>
-    <w:p/>
-    <w:p/>
-    <w:p/>
-    <w:p/>
-    <w:p>
-      <w:r>
-        <w:t>5</w:t>
-      </w:r>
-      <w:r>
-        <w:t>. Timeline:</w:t>
-      </w:r>
-    </w:p>
-    <w:p>
-      <w:pPr>
-        <w:pStyle w:val="ListParagraph"/>
-        <w:numPr>
-          <w:ilvl w:val="0"/>
-          <w:numId w:val="2"/>
-        </w:numPr>
-      </w:pPr>
-      <w:r>
-        <w:t>Provide a detailed timeline or schedule for the project, including key milestones and deadlines.</w:t>
-      </w:r>
-    </w:p>
-    <w:p>
-      <w:pPr>
-        <w:pStyle w:val="ListParagraph"/>
-        <w:numPr>
-          <w:ilvl w:val="0"/>
-          <w:numId w:val="2"/>
-        </w:numPr>
-      </w:pPr>
-      <w:r>
-        <w:t>Break down the project into smaller tasks or phases and allocate time accordingly.</w:t>
-      </w:r>
-    </w:p>
-    <w:p/>
-    <w:p/>
-    <w:p/>
-    <w:p/>
-    <w:p/>
-    <w:p/>
-    <w:p/>
-    <w:p>
-      <w:r>
-        <w:t>6</w:t>
-      </w:r>
-      <w:r>
-        <w:t>. Resources:</w:t>
-      </w:r>
-    </w:p>
-    <w:p>
-      <w:pPr>
-        <w:pStyle w:val="ListParagraph"/>
-        <w:numPr>
-          <w:ilvl w:val="0"/>
-          <w:numId w:val="2"/>
-        </w:numPr>
-      </w:pPr>
-      <w:r>
-        <w:lastRenderedPageBreak/>
-        <w:t>Identify the resources required to complete the project (e.g., equipment, software, materials).</w:t>
-      </w:r>
-    </w:p>
-    <w:p>
-      <w:pPr>
-        <w:pStyle w:val="ListParagraph"/>
-        <w:numPr>
-          <w:ilvl w:val="0"/>
-          <w:numId w:val="2"/>
-        </w:numPr>
-      </w:pPr>
-      <w:r>
-        <w:t>Mention any collaborations or partnerships that will be involved in the project.</w:t>
-      </w:r>
-    </w:p>
-    <w:p/>
-    <w:p/>
-    <w:p/>
-    <w:p/>
-    <w:p/>
-    <w:p/>
-    <w:p/>
-    <w:p>
-      <w:r>
-        <w:t>7</w:t>
-      </w:r>
-      <w:r>
-        <w:t>. Ethical Considerations:</w:t>
-      </w:r>
-    </w:p>
-    <w:p>
-      <w:pPr>
-        <w:pStyle w:val="ListParagraph"/>
-        <w:numPr>
-          <w:ilvl w:val="0"/>
-          <w:numId w:val="2"/>
-        </w:numPr>
-      </w:pPr>
-      <w:r>
-        <w:t>Discuss any ethical considerations or potential risks associated with the project.</w:t>
-      </w:r>
-    </w:p>
-    <w:p>
-      <w:pPr>
-        <w:pStyle w:val="ListParagraph"/>
-        <w:numPr>
-          <w:ilvl w:val="0"/>
-          <w:numId w:val="2"/>
-        </w:numPr>
-      </w:pPr>
-      <w:r>
-        <w:t>Explain how ethical guidelines or protocols will be followed during the project.</w:t>
-      </w:r>
-    </w:p>
-    <w:p/>
-    <w:p/>
-    <w:p/>
-    <w:p/>
-    <w:p/>
-    <w:p/>
-    <w:p/>
-    <w:p>
-      <w:r>
-        <w:t>8</w:t>
-      </w:r>
-      <w:r>
-        <w:t>. Conclusion:</w:t>
-      </w:r>
-    </w:p>
-    <w:p>
-      <w:pPr>
-        <w:pStyle w:val="ListParagraph"/>
-        <w:numPr>
-          <w:ilvl w:val="0"/>
-          <w:numId w:val="2"/>
-        </w:numPr>
-      </w:pPr>
-      <w:r>
-        <w:t>Summarize the key points of the project proposal.</w:t>
-      </w:r>
-    </w:p>
-    <w:p>
-      <w:pPr>
-        <w:pStyle w:val="ListParagraph"/>
-        <w:numPr>
-          <w:ilvl w:val="0"/>
-          <w:numId w:val="2"/>
-        </w:numPr>
-      </w:pPr>
-      <w:r>
-        <w:t>Emphasize the potential impact or significance of the project.</w:t>
-      </w:r>
-    </w:p>
-    <w:p/>
-    <w:p/>
-    <w:p/>
-    <w:p/>
-    <w:p/>
-    <w:p/>
-    <w:p/>
-    <w:p>
-      <w:r>
-        <w:t>9</w:t>
-      </w:r>
-      <w:r>
-        <w:t>. References:</w:t>
-      </w:r>
-    </w:p>
-    <w:p>
-      <w:pPr>
-        <w:pStyle w:val="ListParagraph"/>
-        <w:numPr>
-          <w:ilvl w:val="0"/>
-          <w:numId w:val="2"/>
-        </w:numPr>
-      </w:pPr>
-      <w:r>
-        <w:lastRenderedPageBreak/>
         <w:t>Include a list of references cited in the proposal using the appropriate citation style (e.g., APA, MLA).</w:t>
       </w:r>
     </w:p>
@@ -504,6 +839,116 @@
 <file path=word/numbering.xml><?xml version="1.0" encoding="utf-8"?>
 <w:numbering xmlns:wpc="http://schemas.microsoft.com/office/word/2010/wordprocessingCanvas" xmlns:cx="http://schemas.microsoft.com/office/drawing/2014/chartex" xmlns:cx1="http://schemas.microsoft.com/office/drawing/2015/9/8/chartex" xmlns:cx2="http://schemas.microsoft.com/office/drawing/2015/10/21/chartex" xmlns:cx3="http://schemas.microsoft.com/office/drawing/2016/5/9/chartex" xmlns:cx4="http://schemas.microsoft.com/office/drawing/2016/5/10/chartex" xmlns:cx5="http://schemas.microsoft.com/office/drawing/2016/5/11/chartex" xmlns:cx6="http://schemas.microsoft.com/office/drawing/2016/5/12/chartex" xmlns:cx7="http://schemas.microsoft.com/office/drawing/2016/5/13/chartex" xmlns:cx8="http://schemas.microsoft.com/office/drawing/2016/5/14/chartex" xmlns:mc="http://schemas.openxmlformats.org/markup-compatibility/2006" xmlns:aink="http://schemas.microsoft.com/office/drawing/2016/ink" xmlns:am3d="http://schemas.microsoft.com/office/drawing/2017/model3d" xmlns:o="urn:schemas-microsoft-com:office:office" xmlns:oel="http://schemas.microsoft.com/office/2019/extlst" xmlns:r="http://schemas.openxmlformats.org/officeDocument/2006/relationships" xmlns:m="http://schemas.openxmlformats.org/officeDocument/2006/math" xmlns:v="urn:schemas-microsoft-com:vml" xmlns:wp14="http://schemas.microsoft.com/office/word/2010/wordprocessingDrawing" xmlns:wp="http://schemas.openxmlformats.org/drawingml/2006/wordprocessingDrawing" xmlns:w10="urn:schemas-microsoft-com:office:word" xmlns:w="http://schemas.openxmlformats.org/wordprocessingml/2006/main" xmlns:w14="http://schemas.microsoft.com/office/word/2010/wordml" xmlns:w15="http://schemas.microsoft.com/office/word/2012/wordml" xmlns:w16cex="http://schemas.microsoft.com/office/word/2018/wordml/cex" xmlns:w16cid="http://schemas.microsoft.com/office/word/2016/wordml/cid" xmlns:w16="http://schemas.microsoft.com/office/word/2018/wordml" xmlns:w16du="http://schemas.microsoft.com/office/word/2023/wordml/word16du" xmlns:w16sdtdh="http://schemas.microsoft.com/office/word/2020/wordml/sdtdatahash" xmlns:w16sdtfl="http://schemas.microsoft.com/office/word/2024/wordml/sdtformatlock" xmlns:w16se="http://schemas.microsoft.com/office/word/2015/wordml/symex" xmlns:wpg="http://schemas.microsoft.com/office/word/2010/wordprocessingGroup" xmlns:wpi="http://schemas.microsoft.com/office/word/2010/wordprocessingInk" xmlns:wne="http://schemas.microsoft.com/office/word/2006/wordml" xmlns:wps="http://schemas.microsoft.com/office/word/2010/wordprocessingShape" mc:Ignorable="w14 w15 w16se w16cid w16 w16cex w16sdtdh w16sdtfl w16du wp14">
   <w:abstractNum w:abstractNumId="0" w15:restartNumberingAfterBreak="0">
+    <w:nsid w:val="04607A46"/>
+    <w:multiLevelType w:val="hybridMultilevel"/>
+    <w:tmpl w:val="0BDAF8DE"/>
+    <w:lvl w:ilvl="0" w:tplc="0409000F">
+      <w:start w:val="1"/>
+      <w:numFmt w:val="decimal"/>
+      <w:lvlText w:val="%1."/>
+      <w:lvlJc w:val="left"/>
+      <w:pPr>
+        <w:ind w:left="720" w:hanging="360"/>
+      </w:pPr>
+      <w:rPr>
+        <w:rFonts w:hint="default"/>
+      </w:rPr>
+    </w:lvl>
+    <w:lvl w:ilvl="1" w:tplc="0409000F">
+      <w:start w:val="1"/>
+      <w:numFmt w:val="decimal"/>
+      <w:lvlText w:val="%2."/>
+      <w:lvlJc w:val="left"/>
+      <w:pPr>
+        <w:ind w:left="1440" w:hanging="360"/>
+      </w:pPr>
+    </w:lvl>
+    <w:lvl w:ilvl="2" w:tplc="04090005" w:tentative="1">
+      <w:start w:val="1"/>
+      <w:numFmt w:val="bullet"/>
+      <w:lvlText w:val=""/>
+      <w:lvlJc w:val="left"/>
+      <w:pPr>
+        <w:ind w:left="2160" w:hanging="360"/>
+      </w:pPr>
+      <w:rPr>
+        <w:rFonts w:ascii="Wingdings" w:hAnsi="Wingdings" w:hint="default"/>
+      </w:rPr>
+    </w:lvl>
+    <w:lvl w:ilvl="3" w:tplc="04090001" w:tentative="1">
+      <w:start w:val="1"/>
+      <w:numFmt w:val="bullet"/>
+      <w:lvlText w:val=""/>
+      <w:lvlJc w:val="left"/>
+      <w:pPr>
+        <w:ind w:left="2880" w:hanging="360"/>
+      </w:pPr>
+      <w:rPr>
+        <w:rFonts w:ascii="Symbol" w:hAnsi="Symbol" w:hint="default"/>
+      </w:rPr>
+    </w:lvl>
+    <w:lvl w:ilvl="4" w:tplc="04090003" w:tentative="1">
+      <w:start w:val="1"/>
+      <w:numFmt w:val="bullet"/>
+      <w:lvlText w:val="o"/>
+      <w:lvlJc w:val="left"/>
+      <w:pPr>
+        <w:ind w:left="3600" w:hanging="360"/>
+      </w:pPr>
+      <w:rPr>
+        <w:rFonts w:ascii="Courier New" w:hAnsi="Courier New" w:cs="Courier New" w:hint="default"/>
+      </w:rPr>
+    </w:lvl>
+    <w:lvl w:ilvl="5" w:tplc="04090005" w:tentative="1">
+      <w:start w:val="1"/>
+      <w:numFmt w:val="bullet"/>
+      <w:lvlText w:val=""/>
+      <w:lvlJc w:val="left"/>
+      <w:pPr>
+        <w:ind w:left="4320" w:hanging="360"/>
+      </w:pPr>
+      <w:rPr>
+        <w:rFonts w:ascii="Wingdings" w:hAnsi="Wingdings" w:hint="default"/>
+      </w:rPr>
+    </w:lvl>
+    <w:lvl w:ilvl="6" w:tplc="04090001" w:tentative="1">
+      <w:start w:val="1"/>
+      <w:numFmt w:val="bullet"/>
+      <w:lvlText w:val=""/>
+      <w:lvlJc w:val="left"/>
+      <w:pPr>
+        <w:ind w:left="5040" w:hanging="360"/>
+      </w:pPr>
+      <w:rPr>
+        <w:rFonts w:ascii="Symbol" w:hAnsi="Symbol" w:hint="default"/>
+      </w:rPr>
+    </w:lvl>
+    <w:lvl w:ilvl="7" w:tplc="04090003" w:tentative="1">
+      <w:start w:val="1"/>
+      <w:numFmt w:val="bullet"/>
+      <w:lvlText w:val="o"/>
+      <w:lvlJc w:val="left"/>
+      <w:pPr>
+        <w:ind w:left="5760" w:hanging="360"/>
+      </w:pPr>
+      <w:rPr>
+        <w:rFonts w:ascii="Courier New" w:hAnsi="Courier New" w:cs="Courier New" w:hint="default"/>
+      </w:rPr>
+    </w:lvl>
+    <w:lvl w:ilvl="8" w:tplc="04090005" w:tentative="1">
+      <w:start w:val="1"/>
+      <w:numFmt w:val="bullet"/>
+      <w:lvlText w:val=""/>
+      <w:lvlJc w:val="left"/>
+      <w:pPr>
+        <w:ind w:left="6480" w:hanging="360"/>
+      </w:pPr>
+      <w:rPr>
+        <w:rFonts w:ascii="Wingdings" w:hAnsi="Wingdings" w:hint="default"/>
+      </w:rPr>
+    </w:lvl>
+  </w:abstractNum>
+  <w:abstractNum w:abstractNumId="1" w15:restartNumberingAfterBreak="0">
     <w:nsid w:val="0ADD720B"/>
     <w:multiLevelType w:val="hybridMultilevel"/>
     <w:tmpl w:val="CD48E080"/>
@@ -615,7 +1060,7 @@
       </w:rPr>
     </w:lvl>
   </w:abstractNum>
-  <w:abstractNum w:abstractNumId="1" w15:restartNumberingAfterBreak="0">
+  <w:abstractNum w:abstractNumId="2" w15:restartNumberingAfterBreak="0">
     <w:nsid w:val="0FC232A4"/>
     <w:multiLevelType w:val="hybridMultilevel"/>
     <w:tmpl w:val="D452F7A2"/>
@@ -727,7 +1172,7 @@
       </w:rPr>
     </w:lvl>
   </w:abstractNum>
-  <w:abstractNum w:abstractNumId="2" w15:restartNumberingAfterBreak="0">
+  <w:abstractNum w:abstractNumId="3" w15:restartNumberingAfterBreak="0">
     <w:nsid w:val="13CC3C93"/>
     <w:multiLevelType w:val="hybridMultilevel"/>
     <w:tmpl w:val="115AF5B2"/>
@@ -839,7 +1284,7 @@
       </w:rPr>
     </w:lvl>
   </w:abstractNum>
-  <w:abstractNum w:abstractNumId="3" w15:restartNumberingAfterBreak="0">
+  <w:abstractNum w:abstractNumId="4" w15:restartNumberingAfterBreak="0">
     <w:nsid w:val="147D3B2A"/>
     <w:multiLevelType w:val="hybridMultilevel"/>
     <w:tmpl w:val="EAC2A1D0"/>
@@ -952,7 +1397,7 @@
       </w:rPr>
     </w:lvl>
   </w:abstractNum>
-  <w:abstractNum w:abstractNumId="4" w15:restartNumberingAfterBreak="0">
+  <w:abstractNum w:abstractNumId="5" w15:restartNumberingAfterBreak="0">
     <w:nsid w:val="189E0FEE"/>
     <w:multiLevelType w:val="hybridMultilevel"/>
     <w:tmpl w:val="4CD62624"/>
@@ -1064,7 +1509,7 @@
       </w:rPr>
     </w:lvl>
   </w:abstractNum>
-  <w:abstractNum w:abstractNumId="5" w15:restartNumberingAfterBreak="0">
+  <w:abstractNum w:abstractNumId="6" w15:restartNumberingAfterBreak="0">
     <w:nsid w:val="38CB790E"/>
     <w:multiLevelType w:val="hybridMultilevel"/>
     <w:tmpl w:val="B558A33E"/>
@@ -1176,7 +1621,7 @@
       </w:rPr>
     </w:lvl>
   </w:abstractNum>
-  <w:abstractNum w:abstractNumId="6" w15:restartNumberingAfterBreak="0">
+  <w:abstractNum w:abstractNumId="7" w15:restartNumberingAfterBreak="0">
     <w:nsid w:val="442C1AD8"/>
     <w:multiLevelType w:val="hybridMultilevel"/>
     <w:tmpl w:val="F012A2A2"/>
@@ -1288,7 +1733,7 @@
       </w:rPr>
     </w:lvl>
   </w:abstractNum>
-  <w:abstractNum w:abstractNumId="7" w15:restartNumberingAfterBreak="0">
+  <w:abstractNum w:abstractNumId="8" w15:restartNumberingAfterBreak="0">
     <w:nsid w:val="4AC52559"/>
     <w:multiLevelType w:val="hybridMultilevel"/>
     <w:tmpl w:val="EB56DBBE"/>
@@ -1400,7 +1845,7 @@
       </w:rPr>
     </w:lvl>
   </w:abstractNum>
-  <w:abstractNum w:abstractNumId="8" w15:restartNumberingAfterBreak="0">
+  <w:abstractNum w:abstractNumId="9" w15:restartNumberingAfterBreak="0">
     <w:nsid w:val="57517BF4"/>
     <w:multiLevelType w:val="hybridMultilevel"/>
     <w:tmpl w:val="00807122"/>
@@ -1512,7 +1957,435 @@
       </w:rPr>
     </w:lvl>
   </w:abstractNum>
-  <w:abstractNum w:abstractNumId="9" w15:restartNumberingAfterBreak="0">
+  <w:abstractNum w:abstractNumId="10" w15:restartNumberingAfterBreak="0">
+    <w:nsid w:val="5FF86A02"/>
+    <w:multiLevelType w:val="hybridMultilevel"/>
+    <w:tmpl w:val="0D524950"/>
+    <w:lvl w:ilvl="0" w:tplc="0409000F">
+      <w:start w:val="1"/>
+      <w:numFmt w:val="decimal"/>
+      <w:lvlText w:val="%1."/>
+      <w:lvlJc w:val="left"/>
+      <w:pPr>
+        <w:ind w:left="360" w:hanging="360"/>
+      </w:pPr>
+      <w:rPr>
+        <w:rFonts w:hint="default"/>
+      </w:rPr>
+    </w:lvl>
+    <w:lvl w:ilvl="1" w:tplc="04090019" w:tentative="1">
+      <w:start w:val="1"/>
+      <w:numFmt w:val="lowerLetter"/>
+      <w:lvlText w:val="%2."/>
+      <w:lvlJc w:val="left"/>
+      <w:pPr>
+        <w:ind w:left="1080" w:hanging="360"/>
+      </w:pPr>
+    </w:lvl>
+    <w:lvl w:ilvl="2" w:tplc="0409001B" w:tentative="1">
+      <w:start w:val="1"/>
+      <w:numFmt w:val="lowerRoman"/>
+      <w:lvlText w:val="%3."/>
+      <w:lvlJc w:val="right"/>
+      <w:pPr>
+        <w:ind w:left="1800" w:hanging="180"/>
+      </w:pPr>
+    </w:lvl>
+    <w:lvl w:ilvl="3" w:tplc="0409000F" w:tentative="1">
+      <w:start w:val="1"/>
+      <w:numFmt w:val="decimal"/>
+      <w:lvlText w:val="%4."/>
+      <w:lvlJc w:val="left"/>
+      <w:pPr>
+        <w:ind w:left="2520" w:hanging="360"/>
+      </w:pPr>
+    </w:lvl>
+    <w:lvl w:ilvl="4" w:tplc="04090019" w:tentative="1">
+      <w:start w:val="1"/>
+      <w:numFmt w:val="lowerLetter"/>
+      <w:lvlText w:val="%5."/>
+      <w:lvlJc w:val="left"/>
+      <w:pPr>
+        <w:ind w:left="3240" w:hanging="360"/>
+      </w:pPr>
+    </w:lvl>
+    <w:lvl w:ilvl="5" w:tplc="0409001B" w:tentative="1">
+      <w:start w:val="1"/>
+      <w:numFmt w:val="lowerRoman"/>
+      <w:lvlText w:val="%6."/>
+      <w:lvlJc w:val="right"/>
+      <w:pPr>
+        <w:ind w:left="3960" w:hanging="180"/>
+      </w:pPr>
+    </w:lvl>
+    <w:lvl w:ilvl="6" w:tplc="0409000F" w:tentative="1">
+      <w:start w:val="1"/>
+      <w:numFmt w:val="decimal"/>
+      <w:lvlText w:val="%7."/>
+      <w:lvlJc w:val="left"/>
+      <w:pPr>
+        <w:ind w:left="4680" w:hanging="360"/>
+      </w:pPr>
+    </w:lvl>
+    <w:lvl w:ilvl="7" w:tplc="04090019" w:tentative="1">
+      <w:start w:val="1"/>
+      <w:numFmt w:val="lowerLetter"/>
+      <w:lvlText w:val="%8."/>
+      <w:lvlJc w:val="left"/>
+      <w:pPr>
+        <w:ind w:left="5400" w:hanging="360"/>
+      </w:pPr>
+    </w:lvl>
+    <w:lvl w:ilvl="8" w:tplc="0409001B" w:tentative="1">
+      <w:start w:val="1"/>
+      <w:numFmt w:val="lowerRoman"/>
+      <w:lvlText w:val="%9."/>
+      <w:lvlJc w:val="right"/>
+      <w:pPr>
+        <w:ind w:left="6120" w:hanging="180"/>
+      </w:pPr>
+    </w:lvl>
+  </w:abstractNum>
+  <w:abstractNum w:abstractNumId="11" w15:restartNumberingAfterBreak="0">
+    <w:nsid w:val="6A9F1CB9"/>
+    <w:multiLevelType w:val="hybridMultilevel"/>
+    <w:tmpl w:val="28828046"/>
+    <w:lvl w:ilvl="0" w:tplc="04090001">
+      <w:start w:val="1"/>
+      <w:numFmt w:val="bullet"/>
+      <w:lvlText w:val=""/>
+      <w:lvlJc w:val="left"/>
+      <w:pPr>
+        <w:ind w:left="720" w:hanging="360"/>
+      </w:pPr>
+      <w:rPr>
+        <w:rFonts w:ascii="Symbol" w:hAnsi="Symbol" w:hint="default"/>
+      </w:rPr>
+    </w:lvl>
+    <w:lvl w:ilvl="1" w:tplc="04090003" w:tentative="1">
+      <w:start w:val="1"/>
+      <w:numFmt w:val="bullet"/>
+      <w:lvlText w:val="o"/>
+      <w:lvlJc w:val="left"/>
+      <w:pPr>
+        <w:ind w:left="1440" w:hanging="360"/>
+      </w:pPr>
+      <w:rPr>
+        <w:rFonts w:ascii="Courier New" w:hAnsi="Courier New" w:cs="Courier New" w:hint="default"/>
+      </w:rPr>
+    </w:lvl>
+    <w:lvl w:ilvl="2" w:tplc="04090005" w:tentative="1">
+      <w:start w:val="1"/>
+      <w:numFmt w:val="bullet"/>
+      <w:lvlText w:val=""/>
+      <w:lvlJc w:val="left"/>
+      <w:pPr>
+        <w:ind w:left="2160" w:hanging="360"/>
+      </w:pPr>
+      <w:rPr>
+        <w:rFonts w:ascii="Wingdings" w:hAnsi="Wingdings" w:hint="default"/>
+      </w:rPr>
+    </w:lvl>
+    <w:lvl w:ilvl="3" w:tplc="04090001" w:tentative="1">
+      <w:start w:val="1"/>
+      <w:numFmt w:val="bullet"/>
+      <w:lvlText w:val=""/>
+      <w:lvlJc w:val="left"/>
+      <w:pPr>
+        <w:ind w:left="2880" w:hanging="360"/>
+      </w:pPr>
+      <w:rPr>
+        <w:rFonts w:ascii="Symbol" w:hAnsi="Symbol" w:hint="default"/>
+      </w:rPr>
+    </w:lvl>
+    <w:lvl w:ilvl="4" w:tplc="04090003" w:tentative="1">
+      <w:start w:val="1"/>
+      <w:numFmt w:val="bullet"/>
+      <w:lvlText w:val="o"/>
+      <w:lvlJc w:val="left"/>
+      <w:pPr>
+        <w:ind w:left="3600" w:hanging="360"/>
+      </w:pPr>
+      <w:rPr>
+        <w:rFonts w:ascii="Courier New" w:hAnsi="Courier New" w:cs="Courier New" w:hint="default"/>
+      </w:rPr>
+    </w:lvl>
+    <w:lvl w:ilvl="5" w:tplc="04090005" w:tentative="1">
+      <w:start w:val="1"/>
+      <w:numFmt w:val="bullet"/>
+      <w:lvlText w:val=""/>
+      <w:lvlJc w:val="left"/>
+      <w:pPr>
+        <w:ind w:left="4320" w:hanging="360"/>
+      </w:pPr>
+      <w:rPr>
+        <w:rFonts w:ascii="Wingdings" w:hAnsi="Wingdings" w:hint="default"/>
+      </w:rPr>
+    </w:lvl>
+    <w:lvl w:ilvl="6" w:tplc="04090001" w:tentative="1">
+      <w:start w:val="1"/>
+      <w:numFmt w:val="bullet"/>
+      <w:lvlText w:val=""/>
+      <w:lvlJc w:val="left"/>
+      <w:pPr>
+        <w:ind w:left="5040" w:hanging="360"/>
+      </w:pPr>
+      <w:rPr>
+        <w:rFonts w:ascii="Symbol" w:hAnsi="Symbol" w:hint="default"/>
+      </w:rPr>
+    </w:lvl>
+    <w:lvl w:ilvl="7" w:tplc="04090003" w:tentative="1">
+      <w:start w:val="1"/>
+      <w:numFmt w:val="bullet"/>
+      <w:lvlText w:val="o"/>
+      <w:lvlJc w:val="left"/>
+      <w:pPr>
+        <w:ind w:left="5760" w:hanging="360"/>
+      </w:pPr>
+      <w:rPr>
+        <w:rFonts w:ascii="Courier New" w:hAnsi="Courier New" w:cs="Courier New" w:hint="default"/>
+      </w:rPr>
+    </w:lvl>
+    <w:lvl w:ilvl="8" w:tplc="04090005" w:tentative="1">
+      <w:start w:val="1"/>
+      <w:numFmt w:val="bullet"/>
+      <w:lvlText w:val=""/>
+      <w:lvlJc w:val="left"/>
+      <w:pPr>
+        <w:ind w:left="6480" w:hanging="360"/>
+      </w:pPr>
+      <w:rPr>
+        <w:rFonts w:ascii="Wingdings" w:hAnsi="Wingdings" w:hint="default"/>
+      </w:rPr>
+    </w:lvl>
+  </w:abstractNum>
+  <w:abstractNum w:abstractNumId="12" w15:restartNumberingAfterBreak="0">
+    <w:nsid w:val="6E8124B7"/>
+    <w:multiLevelType w:val="hybridMultilevel"/>
+    <w:tmpl w:val="5894BE3E"/>
+    <w:lvl w:ilvl="0" w:tplc="04090001">
+      <w:start w:val="1"/>
+      <w:numFmt w:val="bullet"/>
+      <w:lvlText w:val=""/>
+      <w:lvlJc w:val="left"/>
+      <w:pPr>
+        <w:ind w:left="1440" w:hanging="360"/>
+      </w:pPr>
+      <w:rPr>
+        <w:rFonts w:ascii="Symbol" w:hAnsi="Symbol" w:hint="default"/>
+      </w:rPr>
+    </w:lvl>
+    <w:lvl w:ilvl="1" w:tplc="04090003" w:tentative="1">
+      <w:start w:val="1"/>
+      <w:numFmt w:val="bullet"/>
+      <w:lvlText w:val="o"/>
+      <w:lvlJc w:val="left"/>
+      <w:pPr>
+        <w:ind w:left="2160" w:hanging="360"/>
+      </w:pPr>
+      <w:rPr>
+        <w:rFonts w:ascii="Courier New" w:hAnsi="Courier New" w:cs="Courier New" w:hint="default"/>
+      </w:rPr>
+    </w:lvl>
+    <w:lvl w:ilvl="2" w:tplc="04090005" w:tentative="1">
+      <w:start w:val="1"/>
+      <w:numFmt w:val="bullet"/>
+      <w:lvlText w:val=""/>
+      <w:lvlJc w:val="left"/>
+      <w:pPr>
+        <w:ind w:left="2880" w:hanging="360"/>
+      </w:pPr>
+      <w:rPr>
+        <w:rFonts w:ascii="Wingdings" w:hAnsi="Wingdings" w:hint="default"/>
+      </w:rPr>
+    </w:lvl>
+    <w:lvl w:ilvl="3" w:tplc="04090001" w:tentative="1">
+      <w:start w:val="1"/>
+      <w:numFmt w:val="bullet"/>
+      <w:lvlText w:val=""/>
+      <w:lvlJc w:val="left"/>
+      <w:pPr>
+        <w:ind w:left="3600" w:hanging="360"/>
+      </w:pPr>
+      <w:rPr>
+        <w:rFonts w:ascii="Symbol" w:hAnsi="Symbol" w:hint="default"/>
+      </w:rPr>
+    </w:lvl>
+    <w:lvl w:ilvl="4" w:tplc="04090003" w:tentative="1">
+      <w:start w:val="1"/>
+      <w:numFmt w:val="bullet"/>
+      <w:lvlText w:val="o"/>
+      <w:lvlJc w:val="left"/>
+      <w:pPr>
+        <w:ind w:left="4320" w:hanging="360"/>
+      </w:pPr>
+      <w:rPr>
+        <w:rFonts w:ascii="Courier New" w:hAnsi="Courier New" w:cs="Courier New" w:hint="default"/>
+      </w:rPr>
+    </w:lvl>
+    <w:lvl w:ilvl="5" w:tplc="04090005" w:tentative="1">
+      <w:start w:val="1"/>
+      <w:numFmt w:val="bullet"/>
+      <w:lvlText w:val=""/>
+      <w:lvlJc w:val="left"/>
+      <w:pPr>
+        <w:ind w:left="5040" w:hanging="360"/>
+      </w:pPr>
+      <w:rPr>
+        <w:rFonts w:ascii="Wingdings" w:hAnsi="Wingdings" w:hint="default"/>
+      </w:rPr>
+    </w:lvl>
+    <w:lvl w:ilvl="6" w:tplc="04090001" w:tentative="1">
+      <w:start w:val="1"/>
+      <w:numFmt w:val="bullet"/>
+      <w:lvlText w:val=""/>
+      <w:lvlJc w:val="left"/>
+      <w:pPr>
+        <w:ind w:left="5760" w:hanging="360"/>
+      </w:pPr>
+      <w:rPr>
+        <w:rFonts w:ascii="Symbol" w:hAnsi="Symbol" w:hint="default"/>
+      </w:rPr>
+    </w:lvl>
+    <w:lvl w:ilvl="7" w:tplc="04090003" w:tentative="1">
+      <w:start w:val="1"/>
+      <w:numFmt w:val="bullet"/>
+      <w:lvlText w:val="o"/>
+      <w:lvlJc w:val="left"/>
+      <w:pPr>
+        <w:ind w:left="6480" w:hanging="360"/>
+      </w:pPr>
+      <w:rPr>
+        <w:rFonts w:ascii="Courier New" w:hAnsi="Courier New" w:cs="Courier New" w:hint="default"/>
+      </w:rPr>
+    </w:lvl>
+    <w:lvl w:ilvl="8" w:tplc="04090005" w:tentative="1">
+      <w:start w:val="1"/>
+      <w:numFmt w:val="bullet"/>
+      <w:lvlText w:val=""/>
+      <w:lvlJc w:val="left"/>
+      <w:pPr>
+        <w:ind w:left="7200" w:hanging="360"/>
+      </w:pPr>
+      <w:rPr>
+        <w:rFonts w:ascii="Wingdings" w:hAnsi="Wingdings" w:hint="default"/>
+      </w:rPr>
+    </w:lvl>
+  </w:abstractNum>
+  <w:abstractNum w:abstractNumId="13" w15:restartNumberingAfterBreak="0">
+    <w:nsid w:val="722E1906"/>
+    <w:multiLevelType w:val="hybridMultilevel"/>
+    <w:tmpl w:val="5656AC04"/>
+    <w:lvl w:ilvl="0" w:tplc="04090001">
+      <w:start w:val="1"/>
+      <w:numFmt w:val="bullet"/>
+      <w:lvlText w:val=""/>
+      <w:lvlJc w:val="left"/>
+      <w:pPr>
+        <w:ind w:left="1440" w:hanging="360"/>
+      </w:pPr>
+      <w:rPr>
+        <w:rFonts w:ascii="Symbol" w:hAnsi="Symbol" w:hint="default"/>
+      </w:rPr>
+    </w:lvl>
+    <w:lvl w:ilvl="1" w:tplc="04090003" w:tentative="1">
+      <w:start w:val="1"/>
+      <w:numFmt w:val="bullet"/>
+      <w:lvlText w:val="o"/>
+      <w:lvlJc w:val="left"/>
+      <w:pPr>
+        <w:ind w:left="2160" w:hanging="360"/>
+      </w:pPr>
+      <w:rPr>
+        <w:rFonts w:ascii="Courier New" w:hAnsi="Courier New" w:cs="Courier New" w:hint="default"/>
+      </w:rPr>
+    </w:lvl>
+    <w:lvl w:ilvl="2" w:tplc="04090005" w:tentative="1">
+      <w:start w:val="1"/>
+      <w:numFmt w:val="bullet"/>
+      <w:lvlText w:val=""/>
+      <w:lvlJc w:val="left"/>
+      <w:pPr>
+        <w:ind w:left="2880" w:hanging="360"/>
+      </w:pPr>
+      <w:rPr>
+        <w:rFonts w:ascii="Wingdings" w:hAnsi="Wingdings" w:hint="default"/>
+      </w:rPr>
+    </w:lvl>
+    <w:lvl w:ilvl="3" w:tplc="04090001" w:tentative="1">
+      <w:start w:val="1"/>
+      <w:numFmt w:val="bullet"/>
+      <w:lvlText w:val=""/>
+      <w:lvlJc w:val="left"/>
+      <w:pPr>
+        <w:ind w:left="3600" w:hanging="360"/>
+      </w:pPr>
+      <w:rPr>
+        <w:rFonts w:ascii="Symbol" w:hAnsi="Symbol" w:hint="default"/>
+      </w:rPr>
+    </w:lvl>
+    <w:lvl w:ilvl="4" w:tplc="04090003" w:tentative="1">
+      <w:start w:val="1"/>
+      <w:numFmt w:val="bullet"/>
+      <w:lvlText w:val="o"/>
+      <w:lvlJc w:val="left"/>
+      <w:pPr>
+        <w:ind w:left="4320" w:hanging="360"/>
+      </w:pPr>
+      <w:rPr>
+        <w:rFonts w:ascii="Courier New" w:hAnsi="Courier New" w:cs="Courier New" w:hint="default"/>
+      </w:rPr>
+    </w:lvl>
+    <w:lvl w:ilvl="5" w:tplc="04090005" w:tentative="1">
+      <w:start w:val="1"/>
+      <w:numFmt w:val="bullet"/>
+      <w:lvlText w:val=""/>
+      <w:lvlJc w:val="left"/>
+      <w:pPr>
+        <w:ind w:left="5040" w:hanging="360"/>
+      </w:pPr>
+      <w:rPr>
+        <w:rFonts w:ascii="Wingdings" w:hAnsi="Wingdings" w:hint="default"/>
+      </w:rPr>
+    </w:lvl>
+    <w:lvl w:ilvl="6" w:tplc="04090001" w:tentative="1">
+      <w:start w:val="1"/>
+      <w:numFmt w:val="bullet"/>
+      <w:lvlText w:val=""/>
+      <w:lvlJc w:val="left"/>
+      <w:pPr>
+        <w:ind w:left="5760" w:hanging="360"/>
+      </w:pPr>
+      <w:rPr>
+        <w:rFonts w:ascii="Symbol" w:hAnsi="Symbol" w:hint="default"/>
+      </w:rPr>
+    </w:lvl>
+    <w:lvl w:ilvl="7" w:tplc="04090003" w:tentative="1">
+      <w:start w:val="1"/>
+      <w:numFmt w:val="bullet"/>
+      <w:lvlText w:val="o"/>
+      <w:lvlJc w:val="left"/>
+      <w:pPr>
+        <w:ind w:left="6480" w:hanging="360"/>
+      </w:pPr>
+      <w:rPr>
+        <w:rFonts w:ascii="Courier New" w:hAnsi="Courier New" w:cs="Courier New" w:hint="default"/>
+      </w:rPr>
+    </w:lvl>
+    <w:lvl w:ilvl="8" w:tplc="04090005" w:tentative="1">
+      <w:start w:val="1"/>
+      <w:numFmt w:val="bullet"/>
+      <w:lvlText w:val=""/>
+      <w:lvlJc w:val="left"/>
+      <w:pPr>
+        <w:ind w:left="7200" w:hanging="360"/>
+      </w:pPr>
+      <w:rPr>
+        <w:rFonts w:ascii="Wingdings" w:hAnsi="Wingdings" w:hint="default"/>
+      </w:rPr>
+    </w:lvl>
+  </w:abstractNum>
+  <w:abstractNum w:abstractNumId="14" w15:restartNumberingAfterBreak="0">
     <w:nsid w:val="7E6F2A03"/>
     <w:multiLevelType w:val="hybridMultilevel"/>
     <w:tmpl w:val="5860E076"/>
@@ -1601,7 +2474,7 @@
       </w:pPr>
     </w:lvl>
   </w:abstractNum>
-  <w:abstractNum w:abstractNumId="10" w15:restartNumberingAfterBreak="0">
+  <w:abstractNum w:abstractNumId="15" w15:restartNumberingAfterBreak="0">
     <w:nsid w:val="7EC17C5E"/>
     <w:multiLevelType w:val="hybridMultilevel"/>
     <w:tmpl w:val="FB22FD22"/>
@@ -1715,37 +2588,52 @@
     </w:lvl>
   </w:abstractNum>
   <w:num w:numId="1" w16cid:durableId="560753377">
+    <w:abstractNumId w:val="4"/>
+  </w:num>
+  <w:num w:numId="2" w16cid:durableId="51583759">
+    <w:abstractNumId w:val="5"/>
+  </w:num>
+  <w:num w:numId="3" w16cid:durableId="1887453363">
+    <w:abstractNumId w:val="9"/>
+  </w:num>
+  <w:num w:numId="4" w16cid:durableId="2083138327">
+    <w:abstractNumId w:val="7"/>
+  </w:num>
+  <w:num w:numId="5" w16cid:durableId="1025054954">
+    <w:abstractNumId w:val="1"/>
+  </w:num>
+  <w:num w:numId="6" w16cid:durableId="704597180">
+    <w:abstractNumId w:val="2"/>
+  </w:num>
+  <w:num w:numId="7" w16cid:durableId="578096172">
+    <w:abstractNumId w:val="6"/>
+  </w:num>
+  <w:num w:numId="8" w16cid:durableId="997617107">
     <w:abstractNumId w:val="3"/>
   </w:num>
-  <w:num w:numId="2" w16cid:durableId="51583759">
-    <w:abstractNumId w:val="4"/>
-  </w:num>
-  <w:num w:numId="3" w16cid:durableId="1887453363">
+  <w:num w:numId="9" w16cid:durableId="1515611120">
     <w:abstractNumId w:val="8"/>
   </w:num>
-  <w:num w:numId="4" w16cid:durableId="2083138327">
-    <w:abstractNumId w:val="6"/>
+  <w:num w:numId="10" w16cid:durableId="1540628828">
+    <w:abstractNumId w:val="15"/>
   </w:num>
-  <w:num w:numId="5" w16cid:durableId="1025054954">
+  <w:num w:numId="11" w16cid:durableId="425464643">
+    <w:abstractNumId w:val="14"/>
+  </w:num>
+  <w:num w:numId="12" w16cid:durableId="1498036300">
+    <w:abstractNumId w:val="12"/>
+  </w:num>
+  <w:num w:numId="13" w16cid:durableId="1472095034">
+    <w:abstractNumId w:val="13"/>
+  </w:num>
+  <w:num w:numId="14" w16cid:durableId="618948523">
+    <w:abstractNumId w:val="11"/>
+  </w:num>
+  <w:num w:numId="15" w16cid:durableId="333804574">
     <w:abstractNumId w:val="0"/>
   </w:num>
-  <w:num w:numId="6" w16cid:durableId="704597180">
-    <w:abstractNumId w:val="1"/>
-  </w:num>
-  <w:num w:numId="7" w16cid:durableId="578096172">
-    <w:abstractNumId w:val="5"/>
-  </w:num>
-  <w:num w:numId="8" w16cid:durableId="997617107">
-    <w:abstractNumId w:val="2"/>
-  </w:num>
-  <w:num w:numId="9" w16cid:durableId="1515611120">
-    <w:abstractNumId w:val="7"/>
-  </w:num>
-  <w:num w:numId="10" w16cid:durableId="1540628828">
+  <w:num w:numId="16" w16cid:durableId="558787861">
     <w:abstractNumId w:val="10"/>
-  </w:num>
-  <w:num w:numId="11" w16cid:durableId="425464643">
-    <w:abstractNumId w:val="9"/>
   </w:num>
 </w:numbering>
 </file>
@@ -2256,6 +3144,25 @@
       <w:szCs w:val="26"/>
     </w:rPr>
   </w:style>
+  <w:style w:type="paragraph" w:styleId="Caption">
+    <w:name w:val="caption"/>
+    <w:basedOn w:val="Normal"/>
+    <w:next w:val="Normal"/>
+    <w:uiPriority w:val="35"/>
+    <w:unhideWhenUsed/>
+    <w:qFormat/>
+    <w:rsid w:val="00492225"/>
+    <w:pPr>
+      <w:spacing w:after="200" w:line="240" w:lineRule="auto"/>
+    </w:pPr>
+    <w:rPr>
+      <w:i/>
+      <w:iCs/>
+      <w:color w:val="44546A" w:themeColor="text2"/>
+      <w:sz w:val="18"/>
+      <w:szCs w:val="18"/>
+    </w:rPr>
+  </w:style>
 </w:styles>
 </file>
 

</xml_diff>